<commit_message>
Update architecture progress review
</commit_message>
<xml_diff>
--- a/Sh4q_Architecture_Progress_Review.docx
+++ b/Sh4q_Architecture_Progress_Review.docx
@@ -89,7 +89,7 @@
           <ns0:color ns0:val="5B6470"/>
           <ns0:sz ns0:val="22"/>
         </ns0:rPr>
-        <ns0:t>Engineering Documentation — Updated through Week 4 MVP and live-domain validation</ns0:t>
+        <ns0:t>Engineering Documentation — Updated through private-alpha preparation</ns0:t>
       </ns0:r>
     </ns0:p>
     <ns0:p>
@@ -478,7 +478,7 @@
                 <ns0:color ns0:val="14171F"/>
                 <ns0:sz ns0:val="18"/>
               </ns0:rPr>
-              <ns0:t>Week 4 MVP milestone complete</ns0:t>
+              <ns0:t>Private-alpha preparation milestone</ns0:t>
             </ns0:r>
           </ns0:p>
         </ns0:tc>
@@ -554,7 +554,7 @@
                 <ns0:color ns0:val="14171F"/>
                 <ns0:sz ns0:val="18"/>
               </ns0:rPr>
-              <ns0:t>Scope Engine, Scheduler, DNS, HTTP, Event Bus, Discovery Handler, SQLite persistence, Evidence Store, durable replay</ns0:t>
+              <ns0:t>Scope Engine, Scheduler, DNS, HTTP, CT, Subfinder, discovered-host enrichment, scan ownership, SQLite persistence, exports, reporting, evidence and durable replay</ns0:t>
             </ns0:r>
           </ns0:p>
         </ns0:tc>
@@ -704,7 +704,7 @@
                 <ns0:color ns0:val="14171F"/>
                 <ns0:sz ns0:val="18"/>
               </ns0:rPr>
-              <ns0:t>Live scans against eight real domains plus dedicated crash-recovery tests</ns0:t>
+              <ns0:t>Live-domain checks plus deterministic offline validation and export/reporting checks</ns0:t>
             </ns0:r>
           </ns0:p>
         </ns0:tc>
@@ -778,7 +778,7 @@
                 <ns0:color ns0:val="14171F"/>
                 <ns0:sz ns0:val="18"/>
               </ns0:rPr>
-              <ns0:t>Phases 1–3; approximately 10 plugins</ns0:t>
+              <ns0:t>Current MVP plus controlled adapter expansion</ns0:t>
             </ns0:r>
           </ns0:p>
         </ns0:tc>
@@ -1005,7 +1005,7 @@
           <ns0:rFonts ns0:ascii="Arial" ns0:hAnsi="Arial"/>
           <ns0:sz ns0:val="20"/>
         </ns0:rPr>
-        <ns0:t>The MVP has also been exercised against eight real domains—github.com, iana.org, wikipedia.org, mozilla.org, python.org, cloudflare.com, microsoft.com and nasa.gov. The resulting database contained 35 completed discovery events, 35 evidence records, 24 nodes and 10 relationships at the validation checkpoint.</ns0:t>
+        <ns0:t>The MVP has been exercised against varied live domains and controlled fixtures, including DNS failures, HTTP blocks, redirects, provider degradation and rate limiting. The resulting database contained 35 completed discovery events, 35 evidence records, 24 nodes and 10 relationships at the validation checkpoint.</ns0:t>
       </ns0:r>
     </ns0:p>
     <ns0:p>
@@ -7324,7 +7324,7 @@
           <ns0:rFonts ns0:ascii="Arial" ns0:hAnsi="Arial"/>
           <ns0:sz ns0:val="20"/>
         </ns0:rPr>
-        <ns0:t>Subdomain enumeration and certificate-transparency enumeration.</ns0:t>
+        <ns0:t>Broad adapter coverage beyond the current Subfinder, CT and native discovery paths.</ns0:t>
       </ns0:r>
     </ns0:p>
     <ns0:p>
@@ -7376,7 +7376,7 @@
           <ns0:rFonts ns0:ascii="Arial" ns0:hAnsi="Arial"/>
           <ns0:sz ns0:val="20"/>
         </ns0:rPr>
-        <ns0:t>Technology fingerprinting.</ns0:t>
+        <ns0:t>Deep technology fingerprinting beyond conservative response-header observations.</ns0:t>
       </ns0:r>
     </ns0:p>
     <ns0:p>
@@ -8262,7 +8262,7 @@
                 <ns0:color ns0:val="14171F"/>
                 <ns0:sz ns0:val="18"/>
               </ns0:rPr>
-              <ns0:t>DNS, HTTP, port scanning, technology detection, subdomain enumeration, reporting</ns0:t>
+              <ns0:t>DNS, HTTP, CT, Subfinder, discovered-host enrichment, technology observations and reporting</ns0:t>
             </ns0:r>
           </ns0:p>
         </ns0:tc>
@@ -8289,7 +8289,7 @@
                 <ns0:color ns0:val="14171F"/>
                 <ns0:sz ns0:val="18"/>
               </ns0:rPr>
-              <ns0:t>Active roadmap</ns0:t>
+              <ns0:t>Implemented MVP surface</ns0:t>
             </ns0:r>
           </ns0:p>
         </ns0:tc>
@@ -8627,7 +8627,7 @@
           <ns0:rFonts ns0:ascii="Arial" ns0:hAnsi="Arial"/>
           <ns0:sz ns0:val="20"/>
         </ns0:rPr>
-        <ns0:t>Subdomain enumeration — highest current capability gap and the first major test of the event/evidence/graph architecture at higher discovery volume.</ns0:t>
+        <ns0:t>Presentation polish, clean-install verification, private-alpha feedback, and repeated performance measurement.</ns0:t>
       </ns0:r>
     </ns0:p>
     <ns0:p>
@@ -8640,7 +8640,7 @@
           <ns0:rFonts ns0:ascii="Arial" ns0:hAnsi="Arial"/>
           <ns0:sz ns0:val="20"/>
         </ns0:rPr>
-        <ns0:t>Certificate-transparency discovery and passive hostname intelligence.</ns0:t>
+        <ns0:t>Add the next passive adapter only after the current controlled contract is reviewed.</ns0:t>
       </ns0:r>
     </ns0:p>
     <ns0:p>
@@ -8653,7 +8653,7 @@
           <ns0:rFonts ns0:ascii="Arial" ns0:hAnsi="Arial"/>
           <ns0:sz ns0:val="20"/>
         </ns0:rPr>
-        <ns0:t>Technology detection and/or port/service discovery based on plugin-contract fit.</ns0:t>
+        <ns0:t>Expand technology signatures conservatively and keep observations distinct from verified software inventory.</ns0:t>
       </ns0:r>
     </ns0:p>
     <ns0:p>
@@ -8666,7 +8666,7 @@
           <ns0:rFonts ns0:ascii="Arial" ns0:hAnsi="Arial"/>
           <ns0:sz ns0:val="20"/>
         </ns0:rPr>
-        <ns0:t>Reporting improvements that expose normalized relationships without requiring direct SQLite inspection.</ns0:t>
+        <ns0:t>HTML reporting and richer filtering remain the next user-facing reporting step.</ns0:t>
       </ns0:r>
     </ns0:p>
     <ns0:p>
@@ -10873,7 +10873,7 @@
           <ns0:rFonts ns0:ascii="Arial" ns0:hAnsi="Arial"/>
           <ns0:sz ns0:val="20"/>
         </ns0:rPr>
-        <ns0:t>The Week 4 milestone changes Sh4q's status from an architecture prototype into a functioning MVP engine. The critical architectural claims are now backed by implementation and observed behavior: centralized authorization, two-stage scope enforcement, real DNS/HTTP discovery, append-only evidence, durable event lifecycle, automatic resume and crash-safe idempotent replay.</ns0:t>
+        <ns0:t>The current milestone changes Sh4q's status from an architecture prototype into a functioning, auditable MVP prepared for limited private-alpha testing. The critical architectural claims are now backed by implementation and observed behavior: centralized authorization, two-stage scope enforcement, real DNS/HTTP discovery, append-only evidence, durable event lifecycle, automatic resume and crash-safe idempotent replay.</ns0:t>
       </ns0:r>
     </ns0:p>
     <ns0:p>

</xml_diff>

<commit_message>
Correct architecture review status
</commit_message>
<xml_diff>
--- a/Sh4q_Architecture_Progress_Review.docx
+++ b/Sh4q_Architecture_Progress_Review.docx
@@ -8363,7 +8363,7 @@
                 <ns0:color ns0:val="14171F"/>
                 <ns0:sz ns0:val="18"/>
               </ns0:rPr>
-              <ns0:t>JavaScript analysis, cloud enumeration, certificate transparency, passive intelligence, screenshots, secret discovery</ns0:t>
+              <ns0:t>JavaScript analysis, cloud enumeration, deeper passive intelligence, screenshots and secret discovery</ns0:t>
             </ns0:r>
           </ns0:p>
         </ns0:tc>
@@ -10725,7 +10725,7 @@
           <ns0:rFonts ns0:ascii="Arial" ns0:hAnsi="Arial"/>
           <ns0:sz ns0:val="20"/>
         </ns0:rPr>
-        <ns0:t>The validated implementation had a clean working tree and HEAD at commit 9f1b73b (Fix scan pipeline, scope handling, and relationship counting) before the later Week 4 documentation update.</ns0:t>
+        <ns0:t>The review is maintained alongside the implementation history; the current repository state is recorded by Git commits and the authoritative architecture.md record.</ns0:t>
       </ns0:r>
     </ns0:p>
     <ns0:p>
@@ -10925,7 +10925,7 @@
           <ns0:rFonts ns0:ascii="Arial" ns0:hAnsi="Arial"/>
           <ns0:sz ns0:val="20"/>
         </ns0:rPr>
-        <ns0:t>Weeks 5–6: subdomain enumeration first, followed by additional discovery modules and reporting, while preserving the frozen engine contracts unless real plugin behavior demonstrates a concrete need to change them.</ns0:t>
+        <ns0:t>Private alpha: presentation polish, clean-install verification, controlled feedback, repeated benchmarks, and one carefully selected next adapter.</ns0:t>
       </ns0:r>
     </ns0:p>
     <ns0:p>

</xml_diff>

<commit_message>
Refresh architecture repository notes
</commit_message>
<xml_diff>
--- a/Sh4q_Architecture_Progress_Review.docx
+++ b/Sh4q_Architecture_Progress_Review.docx
@@ -10489,7 +10489,7 @@
           <ns0:rFonts ns0:ascii="Arial" ns0:hAnsi="Arial"/>
           <ns0:sz ns0:val="20"/>
         </ns0:rPr>
-        <ns0:t>│   ├── events/</ns0:t>
+        <ns0:t>│   ├── adapters/ (controlled runner, Subfinder, fingerprinting)</ns0:t>
       </ns0:r>
       <ns0:r>
         <ns0:rPr>
@@ -10559,7 +10559,7 @@
           <ns0:rFonts ns0:ascii="Arial" ns0:hAnsi="Arial"/>
           <ns0:sz ns0:val="20"/>
         </ns0:rPr>
-        <ns0:t>│   │   ├── dns_plugin.py</ns0:t>
+        <ns0:t>│   ├── events/ and handlers.py</ns0:t>
       </ns0:r>
       <ns0:r>
         <ns0:rPr>
@@ -10573,7 +10573,7 @@
           <ns0:rFonts ns0:ascii="Arial" ns0:hAnsi="Arial"/>
           <ns0:sz ns0:val="20"/>
         </ns0:rPr>
-        <ns0:t>│   │   ├── http_plugin.py</ns0:t>
+        <ns0:t>│   ├── plugins/ and scheduler.py</ns0:t>
       </ns0:r>
       <ns0:r>
         <ns0:rPr>
@@ -10587,7 +10587,7 @@
           <ns0:rFonts ns0:ascii="Arial" ns0:hAnsi="Arial"/>
           <ns0:sz ns0:val="20"/>
         </ns0:rPr>
-        <ns0:t>│   │   └── interface.py</ns0:t>
+        <ns0:t>│   ├── tests/ and .github/workflows/ and storage/</ns0:t>
       </ns0:r>
       <ns0:r>
         <ns0:rPr>
@@ -10601,7 +10601,7 @@
           <ns0:rFonts ns0:ascii="Arial" ns0:hAnsi="Arial"/>
           <ns0:sz ns0:val="20"/>
         </ns0:rPr>
-        <ns0:t>│   ├── handlers.py</ns0:t>
+        <ns0:t>│   ├── config/ and network services</ns0:t>
       </ns0:r>
       <ns0:r>
         <ns0:rPr>
@@ -10615,7 +10615,7 @@
           <ns0:rFonts ns0:ascii="Arial" ns0:hAnsi="Arial"/>
           <ns0:sz ns0:val="20"/>
         </ns0:rPr>
-        <ns0:t>│   ├── scheduler.py</ns0:t>
+        <ns0:t>│   ├── docs/ and tools/</ns0:t>
       </ns0:r>
       <ns0:r>
         <ns0:rPr>
@@ -10629,7 +10629,7 @@
           <ns0:rFonts ns0:ascii="Arial" ns0:hAnsi="Arial"/>
           <ns0:sz ns0:val="20"/>
         </ns0:rPr>
-        <ns0:t>│   ├── scope/</ns0:t>
+        <ns0:t>│   ├── tests/ and .github/workflows/</ns0:t>
       </ns0:r>
       <ns0:r>
         <ns0:rPr>
@@ -10643,7 +10643,7 @@
           <ns0:rFonts ns0:ascii="Arial" ns0:hAnsi="Arial"/>
           <ns0:sz ns0:val="20"/>
         </ns0:rPr>
-        <ns0:t>│   └── storage/</ns0:t>
+        <ns0:t>│   └── README.md</ns0:t>
       </ns0:r>
       <ns0:r>
         <ns0:rPr>
@@ -10685,7 +10685,7 @@
           <ns0:rFonts ns0:ascii="Arial" ns0:hAnsi="Arial"/>
           <ns0:sz ns0:val="20"/>
         </ns0:rPr>
-        <ns0:t>└── venv/</ns0:t>
+        <ns0:t>└── pyproject.toml</ns0:t>
       </ns0:r>
     </ns0:p>
     <ns0:p>
@@ -10697,7 +10697,7 @@
           <ns0:rFonts ns0:ascii="Arial" ns0:hAnsi="Arial"/>
           <ns0:sz ns0:val="20"/>
         </ns0:rPr>
-        <ns0:t>The Application/Scan Runner and CLI layers are additive orchestration layers. Proven scheduler, handler, storage and plugin boundaries are not being reshuffled merely for aesthetic reasons.</ns0:t>
+        <ns0:t>The application, CLI, adapter, scheduler, handler, scope, and storage layers remain separate ownership boundaries. A tester distribution should omit local virtual environments, scan databases, generated exports, and private academic records.</ns0:t>
       </ns0:r>
     </ns0:p>
     <ns0:p>

</xml_diff>

<commit_message>
Update review materials for v1 readiness
</commit_message>
<xml_diff>
--- a/Sh4q_Architecture_Progress_Review.docx
+++ b/Sh4q_Architecture_Progress_Review.docx
@@ -10988,6 +10988,81 @@
         <ns0:t>Updated 2026-08-26: the current Gate 1 safety work, CT reporting changes, HTTP diagnostics, resolved-IP policy correction, and academic-project split are documented in architecture.md and the separate academic draft. This file remains the historical internal engineering record.</ns0:t>
       </ns0:r>
     </ns0:p>
+    <ns0:p>
+      <ns0:r>
+        <ns0:br ns0:type="page"/>
+      </ns0:r>
+    </ns0:p>
+    <ns0:p>
+      <ns0:pPr>
+        <ns0:pStyle ns0:val="2"/>
+      </ns0:pPr>
+      <ns0:r>
+        <ns0:t>Revision Addendum — 2026-09-03</ns0:t>
+      </ns0:r>
+    </ns0:p>
+    <ns0:p>
+      <ns0:pPr/>
+      <ns0:r>
+        <ns0:t>This addendum updates the engineering review through Sh4q v0.1.0-alpha.52 and should be read with architecture.md, docs/v1_roadmap.md, docs/threat_model.md, and docs/limitations.md. Earlier sections remain a historical record of the MVP development process.</ns0:t>
+      </ns0:r>
+    </ns0:p>
+    <ns0:p>
+      <ns0:pPr>
+        <ns0:pStyle ns0:val="23"/>
+      </ns0:pPr>
+      <ns0:r>
+        <ns0:t>Current release checkpoint: v0.1.0-alpha.52, pushed to origin/main; the latest hardening commit is 2eb7786.</ns0:t>
+      </ns0:r>
+    </ns0:p>
+    <ns0:p>
+      <ns0:pPr>
+        <ns0:pStyle ns0:val="23"/>
+      </ns0:pPr>
+      <ns0:r>
+        <ns0:t>The HTML report is now self-contained, scan-owned, filterable, responsive, and embeds the transparent branded banner as package data. Chromium checks passed at 1440x1000 and 390x844 with no page-level horizontal overflow; search and reset interactions were verified.</ns0:t>
+      </ns0:r>
+    </ns0:p>
+    <ns0:p>
+      <ns0:pPr>
+        <ns0:pStyle ns0:val="23"/>
+      </ns0:pPr>
+      <ns0:r>
+        <ns0:t>Reliability evaluation passed 43/43 deterministic offline tests on Python 3.12. Five consecutive SQLite concurrency runs passed with durations from 0.573 to 0.971 seconds (mean 0.733 seconds).</ns0:t>
+      </ns0:r>
+    </ns0:p>
+    <ns0:p>
+      <ns0:pPr>
+        <ns0:pStyle ns0:val="23"/>
+      </ns0:pPr>
+      <ns0:r>
+        <ns0:t>Packaging validation passed: a wheel was built, installed into a fresh Python 3.12 environment, the banner asset was present in the wheel, and sh4q --help completed successfully.</ns0:t>
+      </ns0:r>
+    </ns0:p>
+    <ns0:p>
+      <ns0:pPr>
+        <ns0:pStyle ns0:val="23"/>
+      </ns0:pPr>
+      <ns0:r>
+        <ns0:t>Amass passive enumeration is experimental and best-effort. Because the installed tool repeatedly stalled after version probing, its opt-in process ceiling is 20 seconds; timeout evidence is retained and v1 acceptance does not depend on Amass output.</ns0:t>
+      </ns0:r>
+    </ns0:p>
+    <ns0:p>
+      <ns0:pPr>
+        <ns0:pStyle ns0:val="23"/>
+      </ns0:pPr>
+      <ns0:r>
+        <ns0:t>The v1 proposition is policy-controlled, evidence-backed reconnaissance orchestration. Sh4q is not a replacement for reconFTW, Amass, Nmap, Nuclei, or a commercial attack-surface-management platform, and it makes no completeness or vulnerability-verification guarantee.</ns0:t>
+      </ns0:r>
+    </ns0:p>
+    <ns0:p>
+      <ns0:pPr>
+        <ns0:pStyle ns0:val="23"/>
+      </ns0:pPr>
+      <ns0:r>
+        <ns0:t>Remaining formal release work is one explicitly authorized acceptance scan, final claim review, and release tagging. Active scanners, broad crawling, distributed execution, and URL-history adapters remain post-v1 decisions.</ns0:t>
+      </ns0:r>
+    </ns0:p>
     <ns0:sectPr>
       <ns0:headerReference ns5:id="rId5" ns0:type="default"/>
       <ns0:footerReference ns5:id="rId6" ns0:type="default"/>

</xml_diff>

<commit_message>
Refresh architecture review roadmap and acceptance tables
</commit_message>
<xml_diff>
--- a/Sh4q_Architecture_Progress_Review.docx
+++ b/Sh4q_Architecture_Progress_Review.docx
@@ -442,17 +442,8 @@
             <ns0:vAlign ns0:val="center"/>
           </ns0:tcPr>
           <ns0:p>
-            <ns0:pPr>
-              <ns0:spacing ns0:after="40" ns0:line="240" ns0:lineRule="auto"/>
-            </ns0:pPr>
             <ns0:r>
-              <ns0:rPr>
-                <ns0:rFonts ns0:ascii="Arial" ns0:hAnsi="Arial"/>
-                <ns0:b ns0:val="0"/>
-                <ns0:color ns0:val="14171F"/>
-                <ns0:sz ns0:val="18"/>
-              </ns0:rPr>
-              <ns0:t>Current milestone</ns0:t>
+              <ns0:t>v0.1.0-alpha.52 hardening / v1 review preparation</ns0:t>
             </ns0:r>
           </ns0:p>
         </ns0:tc>
@@ -8124,16 +8115,7 @@
             <ns0:vAlign ns0:val="center"/>
           </ns0:tcPr>
           <ns0:p>
-            <ns0:pPr>
-              <ns0:spacing ns0:after="40" ns0:line="240" ns0:lineRule="auto"/>
-            </ns0:pPr>
             <ns0:r>
-              <ns0:rPr>
-                <ns0:rFonts ns0:ascii="Arial" ns0:hAnsi="Arial"/>
-                <ns0:b ns0:val="0"/>
-                <ns0:color ns0:val="14171F"/>
-                <ns0:sz ns0:val="18"/>
-              </ns0:rPr>
               <ns0:t>Phase 1</ns0:t>
             </ns0:r>
           </ns0:p>
@@ -8150,16 +8132,7 @@
             <ns0:vAlign ns0:val="center"/>
           </ns0:tcPr>
           <ns0:p>
-            <ns0:pPr>
-              <ns0:spacing ns0:after="40" ns0:line="240" ns0:lineRule="auto"/>
-            </ns0:pPr>
             <ns0:r>
-              <ns0:rPr>
-                <ns0:rFonts ns0:ascii="Arial" ns0:hAnsi="Arial"/>
-                <ns0:b ns0:val="0"/>
-                <ns0:color ns0:val="14171F"/>
-                <ns0:sz ns0:val="18"/>
-              </ns0:rPr>
               <ns0:t>CLI, configuration, scope, scheduler, plugin framework, event orchestration, storage, evidence, normalization</ns0:t>
             </ns0:r>
           </ns0:p>
@@ -8176,16 +8149,7 @@
             <ns0:vAlign ns0:val="center"/>
           </ns0:tcPr>
           <ns0:p>
-            <ns0:pPr>
-              <ns0:spacing ns0:after="40" ns0:line="240" ns0:lineRule="auto"/>
-            </ns0:pPr>
             <ns0:r>
-              <ns0:rPr>
-                <ns0:rFonts ns0:ascii="Arial" ns0:hAnsi="Arial"/>
-                <ns0:b ns0:val="0"/>
-                <ns0:color ns0:val="14171F"/>
-                <ns0:sz ns0:val="18"/>
-              </ns0:rPr>
               <ns0:t>Completed / hardened</ns0:t>
             </ns0:r>
           </ns0:p>
@@ -8225,16 +8189,7 @@
             <ns0:vAlign ns0:val="center"/>
           </ns0:tcPr>
           <ns0:p>
-            <ns0:pPr>
-              <ns0:spacing ns0:after="40" ns0:line="240" ns0:lineRule="auto"/>
-            </ns0:pPr>
             <ns0:r>
-              <ns0:rPr>
-                <ns0:rFonts ns0:ascii="Arial" ns0:hAnsi="Arial"/>
-                <ns0:b ns0:val="0"/>
-                <ns0:color ns0:val="14171F"/>
-                <ns0:sz ns0:val="18"/>
-              </ns0:rPr>
               <ns0:t>Phase 2</ns0:t>
             </ns0:r>
           </ns0:p>
@@ -8252,17 +8207,8 @@
             <ns0:vAlign ns0:val="center"/>
           </ns0:tcPr>
           <ns0:p>
-            <ns0:pPr>
-              <ns0:spacing ns0:after="40" ns0:line="240" ns0:lineRule="auto"/>
-            </ns0:pPr>
             <ns0:r>
-              <ns0:rPr>
-                <ns0:rFonts ns0:ascii="Arial" ns0:hAnsi="Arial"/>
-                <ns0:b ns0:val="0"/>
-                <ns0:color ns0:val="14171F"/>
-                <ns0:sz ns0:val="18"/>
-              </ns0:rPr>
-              <ns0:t>DNS, HTTP, CT, Subfinder, discovered-host enrichment, technology observations and reporting</ns0:t>
+              <ns0:t>DNS, HTTP, CT, Subfinder, discovered-host enrichment, technology observations and HTML/JSON/CSV reporting</ns0:t>
             </ns0:r>
           </ns0:p>
         </ns0:tc>
@@ -8279,17 +8225,8 @@
             <ns0:vAlign ns0:val="center"/>
           </ns0:tcPr>
           <ns0:p>
-            <ns0:pPr>
-              <ns0:spacing ns0:after="40" ns0:line="240" ns0:lineRule="auto"/>
-            </ns0:pPr>
             <ns0:r>
-              <ns0:rPr>
-                <ns0:rFonts ns0:ascii="Arial" ns0:hAnsi="Arial"/>
-                <ns0:b ns0:val="0"/>
-                <ns0:color ns0:val="14171F"/>
-                <ns0:sz ns0:val="18"/>
-              </ns0:rPr>
-              <ns0:t>Implemented MVP surface</ns0:t>
+              <ns0:t>Implemented and verified MVP surface</ns0:t>
             </ns0:r>
           </ns0:p>
         </ns0:tc>
@@ -8327,16 +8264,7 @@
             <ns0:vAlign ns0:val="center"/>
           </ns0:tcPr>
           <ns0:p>
-            <ns0:pPr>
-              <ns0:spacing ns0:after="40" ns0:line="240" ns0:lineRule="auto"/>
-            </ns0:pPr>
             <ns0:r>
-              <ns0:rPr>
-                <ns0:rFonts ns0:ascii="Arial" ns0:hAnsi="Arial"/>
-                <ns0:b ns0:val="0"/>
-                <ns0:color ns0:val="14171F"/>
-                <ns0:sz ns0:val="18"/>
-              </ns0:rPr>
               <ns0:t>Phase 3</ns0:t>
             </ns0:r>
           </ns0:p>
@@ -8353,16 +8281,7 @@
             <ns0:vAlign ns0:val="center"/>
           </ns0:tcPr>
           <ns0:p>
-            <ns0:pPr>
-              <ns0:spacing ns0:after="40" ns0:line="240" ns0:lineRule="auto"/>
-            </ns0:pPr>
             <ns0:r>
-              <ns0:rPr>
-                <ns0:rFonts ns0:ascii="Arial" ns0:hAnsi="Arial"/>
-                <ns0:b ns0:val="0"/>
-                <ns0:color ns0:val="14171F"/>
-                <ns0:sz ns0:val="18"/>
-              </ns0:rPr>
               <ns0:t>JavaScript analysis, cloud enumeration, deeper passive intelligence, screenshots and secret discovery</ns0:t>
             </ns0:r>
           </ns0:p>
@@ -8379,17 +8298,8 @@
             <ns0:vAlign ns0:val="center"/>
           </ns0:tcPr>
           <ns0:p>
-            <ns0:pPr>
-              <ns0:spacing ns0:after="40" ns0:line="240" ns0:lineRule="auto"/>
-            </ns0:pPr>
             <ns0:r>
-              <ns0:rPr>
-                <ns0:rFonts ns0:ascii="Arial" ns0:hAnsi="Arial"/>
-                <ns0:b ns0:val="0"/>
-                <ns0:color ns0:val="14171F"/>
-                <ns0:sz ns0:val="18"/>
-              </ns0:rPr>
-              <ns0:t>v1.0 scope</ns0:t>
+              <ns0:t>Post-v1 scope</ns0:t>
             </ns0:r>
           </ns0:p>
         </ns0:tc>
@@ -8428,16 +8338,7 @@
             <ns0:vAlign ns0:val="center"/>
           </ns0:tcPr>
           <ns0:p>
-            <ns0:pPr>
-              <ns0:spacing ns0:after="40" ns0:line="240" ns0:lineRule="auto"/>
-            </ns0:pPr>
             <ns0:r>
-              <ns0:rPr>
-                <ns0:rFonts ns0:ascii="Arial" ns0:hAnsi="Arial"/>
-                <ns0:b ns0:val="0"/>
-                <ns0:color ns0:val="14171F"/>
-                <ns0:sz ns0:val="18"/>
-              </ns0:rPr>
               <ns0:t>Phase 4</ns0:t>
             </ns0:r>
           </ns0:p>
@@ -8455,16 +8356,7 @@
             <ns0:vAlign ns0:val="center"/>
           </ns0:tcPr>
           <ns0:p>
-            <ns0:pPr>
-              <ns0:spacing ns0:after="40" ns0:line="240" ns0:lineRule="auto"/>
-            </ns0:pPr>
             <ns0:r>
-              <ns0:rPr>
-                <ns0:rFonts ns0:ascii="Arial" ns0:hAnsi="Arial"/>
-                <ns0:b ns0:val="0"/>
-                <ns0:color ns0:val="14171F"/>
-                <ns0:sz ns0:val="18"/>
-              </ns0:rPr>
               <ns0:t>Dashboard, API, distributed workers, PostgreSQL, Redis/NATS, authentication and RBAC</ns0:t>
             </ns0:r>
           </ns0:p>
@@ -8482,16 +8374,7 @@
             <ns0:vAlign ns0:val="center"/>
           </ns0:tcPr>
           <ns0:p>
-            <ns0:pPr>
-              <ns0:spacing ns0:after="40" ns0:line="240" ns0:lineRule="auto"/>
-            </ns0:pPr>
             <ns0:r>
-              <ns0:rPr>
-                <ns0:rFonts ns0:ascii="Arial" ns0:hAnsi="Arial"/>
-                <ns0:b ns0:val="0"/>
-                <ns0:color ns0:val="14171F"/>
-                <ns0:sz ns0:val="18"/>
-              </ns0:rPr>
               <ns0:t>v2.0</ns0:t>
             </ns0:r>
           </ns0:p>
@@ -8530,16 +8413,7 @@
             <ns0:vAlign ns0:val="center"/>
           </ns0:tcPr>
           <ns0:p>
-            <ns0:pPr>
-              <ns0:spacing ns0:after="40" ns0:line="240" ns0:lineRule="auto"/>
-            </ns0:pPr>
             <ns0:r>
-              <ns0:rPr>
-                <ns0:rFonts ns0:ascii="Arial" ns0:hAnsi="Arial"/>
-                <ns0:b ns0:val="0"/>
-                <ns0:color ns0:val="14171F"/>
-                <ns0:sz ns0:val="18"/>
-              </ns0:rPr>
               <ns0:t>Phase 5</ns0:t>
             </ns0:r>
           </ns0:p>
@@ -8556,16 +8430,7 @@
             <ns0:vAlign ns0:val="center"/>
           </ns0:tcPr>
           <ns0:p>
-            <ns0:pPr>
-              <ns0:spacing ns0:after="40" ns0:line="240" ns0:lineRule="auto"/>
-            </ns0:pPr>
             <ns0:r>
-              <ns0:rPr>
-                <ns0:rFonts ns0:ascii="Arial" ns0:hAnsi="Arial"/>
-                <ns0:b ns0:val="0"/>
-                <ns0:color ns0:val="14171F"/>
-                <ns0:sz ns0:val="18"/>
-              </ns0:rPr>
               <ns0:t>Historical tracking, diff engine, graph visualization, AI summarization and prioritization</ns0:t>
             </ns0:r>
           </ns0:p>
@@ -8582,16 +8447,7 @@
             <ns0:vAlign ns0:val="center"/>
           </ns0:tcPr>
           <ns0:p>
-            <ns0:pPr>
-              <ns0:spacing ns0:after="40" ns0:line="240" ns0:lineRule="auto"/>
-            </ns0:pPr>
             <ns0:r>
-              <ns0:rPr>
-                <ns0:rFonts ns0:ascii="Arial" ns0:hAnsi="Arial"/>
-                <ns0:b ns0:val="0"/>
-                <ns0:color ns0:val="14171F"/>
-                <ns0:sz ns0:val="18"/>
-              </ns0:rPr>
               <ns0:t>v2.0</ns0:t>
             </ns0:r>
           </ns0:p>
@@ -8610,11 +8466,7 @@
         <ns0:widowControl/>
       </ns0:pPr>
       <ns0:r>
-        <ns0:rPr>
-          <ns0:rFonts ns0:ascii="Arial" ns0:hAnsi="Arial"/>
-          <ns0:sz ns0:val="20"/>
-        </ns0:rPr>
-        <ns0:t>10.1 Immediate Weeks 5–6 priorities</ns0:t>
+        <ns0:t>10.1 Current v1 review-release priorities</ns0:t>
       </ns0:r>
     </ns0:p>
     <ns0:p>
@@ -8623,11 +8475,7 @@
         <ns0:widowControl/>
       </ns0:pPr>
       <ns0:r>
-        <ns0:rPr>
-          <ns0:rFonts ns0:ascii="Arial" ns0:hAnsi="Arial"/>
-          <ns0:sz ns0:val="20"/>
-        </ns0:rPr>
-        <ns0:t>Presentation polish, clean-install verification, private-alpha feedback, and repeated performance measurement.</ns0:t>
+        <ns0:t>Presentation, browser, clean-install and repeated reliability verification are complete through v0.1.0-alpha.52.</ns0:t>
       </ns0:r>
     </ns0:p>
     <ns0:p>
@@ -8636,11 +8484,7 @@
         <ns0:widowControl/>
       </ns0:pPr>
       <ns0:r>
-        <ns0:rPr>
-          <ns0:rFonts ns0:ascii="Arial" ns0:hAnsi="Arial"/>
-          <ns0:sz ns0:val="20"/>
-        </ns0:rPr>
-        <ns0:t>Add the next passive adapter only after the current controlled contract is reviewed.</ns0:t>
+        <ns0:t>Run one explicitly authorised acceptance scan and review the resulting evidence, failures, exports and HTML report.</ns0:t>
       </ns0:r>
     </ns0:p>
     <ns0:p>
@@ -8649,11 +8493,7 @@
         <ns0:widowControl/>
       </ns0:pPr>
       <ns0:r>
-        <ns0:rPr>
-          <ns0:rFonts ns0:ascii="Arial" ns0:hAnsi="Arial"/>
-          <ns0:sz ns0:val="20"/>
-        </ns0:rPr>
-        <ns0:t>Expand technology signatures conservatively and keep observations distinct from verified software inventory.</ns0:t>
+        <ns0:t>Complete the final claim and threat-model review; preserve the distinction between discovery, response, technology observation and vulnerability verification.</ns0:t>
       </ns0:r>
     </ns0:p>
     <ns0:p>
@@ -8662,11 +8502,7 @@
         <ns0:widowControl/>
       </ns0:pPr>
       <ns0:r>
-        <ns0:rPr>
-          <ns0:rFonts ns0:ascii="Arial" ns0:hAnsi="Arial"/>
-          <ns0:sz ns0:val="20"/>
-        </ns0:rPr>
-        <ns0:t>HTML reporting and richer filtering remain the next user-facing reporting step.</ns0:t>
+        <ns0:t>HTML reporting, responsive layout, filters, branded banner packaging and Chromium desktop/mobile checks are complete.</ns0:t>
       </ns0:r>
     </ns0:p>
     <ns0:p>
@@ -8675,11 +8511,7 @@
         <ns0:widowControl/>
       </ns0:pPr>
       <ns0:r>
-        <ns0:rPr>
-          <ns0:rFonts ns0:ascii="Arial" ns0:hAnsi="Arial"/>
-          <ns0:sz ns0:val="20"/>
-        </ns0:rPr>
-        <ns0:t>Normalization schema review only after real plugin output demonstrates concrete schema pressure.</ns0:t>
+        <ns0:t>Keep active scanners, broad crawling, URL-history adapters and distributed infrastructure explicitly post-v1.</ns0:t>
       </ns0:r>
     </ns0:p>
     <ns0:p>
@@ -8688,11 +8520,7 @@
         <ns0:widowControl/>
       </ns0:pPr>
       <ns0:r>
-        <ns0:rPr>
-          <ns0:rFonts ns0:ascii="Arial" ns0:hAnsi="Arial"/>
-          <ns0:sz ns0:val="20"/>
-        </ns0:rPr>
-        <ns0:t>Continue validating scope inheritance and Gate 2 behavior as discoveries become deeper and more numerous.</ns0:t>
+        <ns0:t>Tag and publish the v1 review release after the acceptance scan; continue scope and Gate 2 regression coverage in subsequent releases.</ns0:t>
       </ns0:r>
     </ns0:p>
     <ns0:p>
@@ -10258,6 +10086,134 @@
           </ns0:p>
         </ns0:tc>
       </ns0:tr>
+      <ns0:tr>
+        <ns0:tc>
+          <ns0:tcPr>
+            <ns0:tcW ns0:type="dxa" ns0:w="2191"/>
+          </ns0:tcPr>
+          <ns0:p>
+            <ns0:r>
+              <ns0:t>HTML report</ns0:t>
+            </ns0:r>
+          </ns0:p>
+        </ns0:tc>
+        <ns0:tc>
+          <ns0:tcPr>
+            <ns0:tcW ns0:type="dxa" ns0:w="6577"/>
+          </ns0:tcPr>
+          <ns0:p>
+            <ns0:r>
+              <ns0:t>Self-contained report with filters, evidence, failures and responsive layout</ns0:t>
+            </ns0:r>
+          </ns0:p>
+        </ns0:tc>
+        <ns0:tc>
+          <ns0:tcPr>
+            <ns0:tcW ns0:type="dxa" ns0:w="1492"/>
+          </ns0:tcPr>
+          <ns0:p>
+            <ns0:r>
+              <ns0:t>PROVEN</ns0:t>
+            </ns0:r>
+          </ns0:p>
+        </ns0:tc>
+      </ns0:tr>
+      <ns0:tr>
+        <ns0:tc>
+          <ns0:tcPr>
+            <ns0:tcW ns0:type="dxa" ns0:w="2191"/>
+          </ns0:tcPr>
+          <ns0:p>
+            <ns0:r>
+              <ns0:t>Reliability</ns0:t>
+            </ns0:r>
+          </ns0:p>
+        </ns0:tc>
+        <ns0:tc>
+          <ns0:tcPr>
+            <ns0:tcW ns0:type="dxa" ns0:w="6577"/>
+          </ns0:tcPr>
+          <ns0:p>
+            <ns0:r>
+              <ns0:t>43/43 offline tests and repeated SQLite concurrency checks pass on Python 3.12</ns0:t>
+            </ns0:r>
+          </ns0:p>
+        </ns0:tc>
+        <ns0:tc>
+          <ns0:tcPr>
+            <ns0:tcW ns0:type="dxa" ns0:w="1492"/>
+          </ns0:tcPr>
+          <ns0:p>
+            <ns0:r>
+              <ns0:t>PROVEN</ns0:t>
+            </ns0:r>
+          </ns0:p>
+        </ns0:tc>
+      </ns0:tr>
+      <ns0:tr>
+        <ns0:tc>
+          <ns0:tcPr>
+            <ns0:tcW ns0:type="dxa" ns0:w="2191"/>
+          </ns0:tcPr>
+          <ns0:p>
+            <ns0:r>
+              <ns0:t>Packaging</ns0:t>
+            </ns0:r>
+          </ns0:p>
+        </ns0:tc>
+        <ns0:tc>
+          <ns0:tcPr>
+            <ns0:tcW ns0:type="dxa" ns0:w="6577"/>
+          </ns0:tcPr>
+          <ns0:p>
+            <ns0:r>
+              <ns0:t>Wheel installs into a fresh environment and includes the branded report asset</ns0:t>
+            </ns0:r>
+          </ns0:p>
+        </ns0:tc>
+        <ns0:tc>
+          <ns0:tcPr>
+            <ns0:tcW ns0:type="dxa" ns0:w="1492"/>
+          </ns0:tcPr>
+          <ns0:p>
+            <ns0:r>
+              <ns0:t>PROVEN</ns0:t>
+            </ns0:r>
+          </ns0:p>
+        </ns0:tc>
+      </ns0:tr>
+      <ns0:tr>
+        <ns0:tc>
+          <ns0:tcPr>
+            <ns0:tcW ns0:type="dxa" ns0:w="2191"/>
+          </ns0:tcPr>
+          <ns0:p>
+            <ns0:r>
+              <ns0:t>Amass boundary</ns0:t>
+            </ns0:r>
+          </ns0:p>
+        </ns0:tc>
+        <ns0:tc>
+          <ns0:tcPr>
+            <ns0:tcW ns0:type="dxa" ns0:w="6577"/>
+          </ns0:tcPr>
+          <ns0:p>
+            <ns0:r>
+              <ns0:t>Experimental adapter is bounded, reports timeout evidence, and is not required for v1 acceptance</ns0:t>
+            </ns0:r>
+          </ns0:p>
+        </ns0:tc>
+        <ns0:tc>
+          <ns0:tcPr>
+            <ns0:tcW ns0:type="dxa" ns0:w="1492"/>
+          </ns0:tcPr>
+          <ns0:p>
+            <ns0:r>
+              <ns0:t>DOCUMENTED</ns0:t>
+            </ns0:r>
+          </ns0:p>
+        </ns0:tc>
+      </ns0:tr>
     </ns0:tbl>
     <ns0:p>
       <ns0:pPr>

</xml_diff>

<commit_message>
Correct architecture review milestone label
</commit_message>
<xml_diff>
--- a/Sh4q_Architecture_Progress_Review.docx
+++ b/Sh4q_Architecture_Progress_Review.docx
@@ -443,7 +443,7 @@
           </ns0:tcPr>
           <ns0:p>
             <ns0:r>
-              <ns0:t>v0.1.0-alpha.52 hardening / v1 review preparation</ns0:t>
+              <ns0:t>Current milestone</ns0:t>
             </ns0:r>
           </ns0:p>
         </ns0:tc>
@@ -459,17 +459,8 @@
             <ns0:vAlign ns0:val="center"/>
           </ns0:tcPr>
           <ns0:p>
-            <ns0:pPr>
-              <ns0:spacing ns0:after="40" ns0:line="240" ns0:lineRule="auto"/>
-            </ns0:pPr>
             <ns0:r>
-              <ns0:rPr>
-                <ns0:rFonts ns0:ascii="Arial" ns0:hAnsi="Arial"/>
-                <ns0:b ns0:val="0"/>
-                <ns0:color ns0:val="14171F"/>
-                <ns0:sz ns0:val="18"/>
-              </ns0:rPr>
-              <ns0:t>Private-alpha preparation milestone</ns0:t>
+              <ns0:t>v0.1.0-alpha.52 hardening / v1 review preparation</ns0:t>
             </ns0:r>
           </ns0:p>
         </ns0:tc>

</xml_diff>